<commit_message>
Rumus Perpangkatan Universal 4.0 || (10:17 (W . I . B[Waktu Indonesia bagian Barat]), 24/09/2026), Jonggol, Bogor, Indonesia || #NOBELSNOINDONESIANYES #LAWANPEMERINTAHINDONESIAKORUPPENINDASRAKYATINDONESIADENGANPENGETAHUAN #LAWANKEMISKINANDENGANPENDIDIKAN #HIDUPMAHASISWA #HIDUPRAKYATINDONESIA #HIDUPWANGSAINDONESIA #17081945
Rumus Perpangkatan Universal 4.0 || (10:17 (W . I . B[Waktu Indonesia bagian Barat]), 24/09/2026), Jonggol, Bogor, Indonesia || #NOBELSNOINDONESIANYES #LAWANPEMERINTAHINDONESIAKORUPPENINDASRAKYATINDONESIADENGANPENGETAHUAN #LAWANKEMISKINANDENGANPENDIDIKAN #HIDUPMAHASISWA #HIDUPRAKYATINDONESIA #HIDUPWANGSAINDONESIA #17081945
</commit_message>
<xml_diff>
--- a/Rumus Perpangkatan Universal 4.0.docx
+++ b/Rumus Perpangkatan Universal 4.0.docx
@@ -1,6 +1,6 @@
 
 <file path=word/document.xml><?xml version="1.0" encoding="utf-8"?>
-<w:document xmlns:wpc="http://schemas.microsoft.com/office/word/2010/wordprocessingCanvas" xmlns:cx="http://schemas.microsoft.com/office/drawing/2014/chartex" xmlns:cx1="http://schemas.microsoft.com/office/drawing/2015/9/8/chartex" xmlns:cx2="http://schemas.microsoft.com/office/drawing/2015/10/21/chartex" xmlns:cx3="http://schemas.microsoft.com/office/drawing/2016/5/9/chartex" xmlns:cx4="http://schemas.microsoft.com/office/drawing/2016/5/10/chartex" xmlns:cx5="http://schemas.microsoft.com/office/drawing/2016/5/11/chartex" xmlns:cx6="http://schemas.microsoft.com/office/drawing/2016/5/12/chartex" xmlns:cx7="http://schemas.microsoft.com/office/drawing/2016/5/13/chartex" xmlns:cx8="http://schemas.microsoft.com/office/drawing/2016/5/14/chartex" xmlns:mc="http://schemas.openxmlformats.org/markup-compatibility/2006" xmlns:aink="http://schemas.microsoft.com/office/drawing/2016/ink" xmlns:am3d="http://schemas.microsoft.com/office/drawing/2017/model3d" xmlns:o="urn:schemas-microsoft-com:office:office" xmlns:oel="http://schemas.microsoft.com/office/2019/extlst" xmlns:r="http://schemas.openxmlformats.org/officeDocument/2006/relationships" xmlns:m="http://schemas.openxmlformats.org/officeDocument/2006/math" xmlns:v="urn:schemas-microsoft-com:vml" xmlns:wp14="http://schemas.microsoft.com/office/word/2010/wordprocessingDrawing" xmlns:wp="http://schemas.openxmlformats.org/drawingml/2006/wordprocessingDrawing" xmlns:w10="urn:schemas-microsoft-com:office:word" xmlns:w="http://schemas.openxmlformats.org/wordprocessingml/2006/main" xmlns:w14="http://schemas.microsoft.com/office/word/2010/wordml" xmlns:w15="http://schemas.microsoft.com/office/word/2012/wordml" xmlns:w16cex="http://schemas.microsoft.com/office/word/2018/wordml/cex" xmlns:w16cid="http://schemas.microsoft.com/office/word/2016/wordml/cid" xmlns:w16="http://schemas.microsoft.com/office/word/2018/wordml" xmlns:w16sdtdh="http://schemas.microsoft.com/office/word/2020/wordml/sdtdatahash" xmlns:w16se="http://schemas.microsoft.com/office/word/2015/wordml/symex" xmlns:wpg="http://schemas.microsoft.com/office/word/2010/wordprocessingGroup" xmlns:wpi="http://schemas.microsoft.com/office/word/2010/wordprocessingInk" xmlns:wne="http://schemas.microsoft.com/office/word/2006/wordml" xmlns:wps="http://schemas.microsoft.com/office/word/2010/wordprocessingShape" mc:Ignorable="w14 w15 w16se w16cid w16 w16cex w16sdtdh wp14">
+<w:document xmlns:wpc="http://schemas.microsoft.com/office/word/2010/wordprocessingCanvas" xmlns:cx="http://schemas.microsoft.com/office/drawing/2014/chartex" xmlns:cx1="http://schemas.microsoft.com/office/drawing/2015/9/8/chartex" xmlns:cx2="http://schemas.microsoft.com/office/drawing/2015/10/21/chartex" xmlns:cx3="http://schemas.microsoft.com/office/drawing/2016/5/9/chartex" xmlns:cx4="http://schemas.microsoft.com/office/drawing/2016/5/10/chartex" xmlns:cx5="http://schemas.microsoft.com/office/drawing/2016/5/11/chartex" xmlns:cx6="http://schemas.microsoft.com/office/drawing/2016/5/12/chartex" xmlns:cx7="http://schemas.microsoft.com/office/drawing/2016/5/13/chartex" xmlns:cx8="http://schemas.microsoft.com/office/drawing/2016/5/14/chartex" xmlns:mc="http://schemas.openxmlformats.org/markup-compatibility/2006" xmlns:aink="http://schemas.microsoft.com/office/drawing/2016/ink" xmlns:am3d="http://schemas.microsoft.com/office/drawing/2017/model3d" xmlns:o="urn:schemas-microsoft-com:office:office" xmlns:r="http://schemas.openxmlformats.org/officeDocument/2006/relationships" xmlns:m="http://schemas.openxmlformats.org/officeDocument/2006/math" xmlns:v="urn:schemas-microsoft-com:vml" xmlns:wp14="http://schemas.microsoft.com/office/word/2010/wordprocessingDrawing" xmlns:wp="http://schemas.openxmlformats.org/drawingml/2006/wordprocessingDrawing" xmlns:w10="urn:schemas-microsoft-com:office:word" xmlns:w="http://schemas.openxmlformats.org/wordprocessingml/2006/main" xmlns:w14="http://schemas.microsoft.com/office/word/2010/wordml" xmlns:w15="http://schemas.microsoft.com/office/word/2012/wordml" xmlns:w16cex="http://schemas.microsoft.com/office/word/2018/wordml/cex" xmlns:w16cid="http://schemas.microsoft.com/office/word/2016/wordml/cid" xmlns:w16="http://schemas.microsoft.com/office/word/2018/wordml" xmlns:w16sdtdh="http://schemas.microsoft.com/office/word/2020/wordml/sdtdatahash" xmlns:w16se="http://schemas.microsoft.com/office/word/2015/wordml/symex" xmlns:wpg="http://schemas.microsoft.com/office/word/2010/wordprocessingGroup" xmlns:wpi="http://schemas.microsoft.com/office/word/2010/wordprocessingInk" xmlns:wne="http://schemas.microsoft.com/office/word/2006/wordml" xmlns:wps="http://schemas.microsoft.com/office/word/2010/wordprocessingShape" mc:Ignorable="w14 w15 w16se w16cid w16 w16cex w16sdtdh wp14">
   <w:body>
     <w:p>
       <w:pPr>
@@ -77,7 +77,6 @@
           <w:lang w:val="id-ID"/>
         </w:rPr>
       </w:pPr>
-      <w:proofErr w:type="spellStart"/>
       <w:r>
         <w:rPr>
           <w:rFonts w:ascii="Times New Roman" w:eastAsiaTheme="minorEastAsia" w:hAnsi="Times New Roman" w:cs="Times New Roman"/>
@@ -85,37 +84,7 @@
           <w:szCs w:val="24"/>
           <w:lang w:val="id-ID"/>
         </w:rPr>
-        <w:t>by</w:t>
-      </w:r>
-      <w:proofErr w:type="spellEnd"/>
-      <w:r>
-        <w:rPr>
-          <w:rFonts w:ascii="Times New Roman" w:eastAsiaTheme="minorEastAsia" w:hAnsi="Times New Roman" w:cs="Times New Roman"/>
-          <w:sz w:val="24"/>
-          <w:szCs w:val="24"/>
-          <w:lang w:val="id-ID"/>
-        </w:rPr>
-        <w:t xml:space="preserve"> : Samuel Hasiholan Omega Purba, S. </w:t>
-      </w:r>
-      <w:proofErr w:type="spellStart"/>
-      <w:r>
-        <w:rPr>
-          <w:rFonts w:ascii="Times New Roman" w:eastAsiaTheme="minorEastAsia" w:hAnsi="Times New Roman" w:cs="Times New Roman"/>
-          <w:sz w:val="24"/>
-          <w:szCs w:val="24"/>
-          <w:lang w:val="id-ID"/>
-        </w:rPr>
-        <w:t>Tr</w:t>
-      </w:r>
-      <w:proofErr w:type="spellEnd"/>
-      <w:r>
-        <w:rPr>
-          <w:rFonts w:ascii="Times New Roman" w:eastAsiaTheme="minorEastAsia" w:hAnsi="Times New Roman" w:cs="Times New Roman"/>
-          <w:sz w:val="24"/>
-          <w:szCs w:val="24"/>
-          <w:lang w:val="id-ID"/>
-        </w:rPr>
-        <w:t>. T.</w:t>
+        <w:t>by : Samuel Hasiholan Omega Purba, S. Tr. T.</w:t>
       </w:r>
     </w:p>
     <w:p>
@@ -150,7 +119,6 @@
           <w:lang w:val="id-ID"/>
         </w:rPr>
       </w:pPr>
-      <w:proofErr w:type="spellStart"/>
       <w:r>
         <w:rPr>
           <w:rFonts w:ascii="Times New Roman" w:eastAsiaTheme="minorEastAsia" w:hAnsi="Times New Roman" w:cs="Times New Roman"/>
@@ -158,17 +126,7 @@
           <w:szCs w:val="24"/>
           <w:lang w:val="id-ID"/>
         </w:rPr>
-        <w:t>Prodi</w:t>
-      </w:r>
-      <w:proofErr w:type="spellEnd"/>
-      <w:r>
-        <w:rPr>
-          <w:rFonts w:ascii="Times New Roman" w:eastAsiaTheme="minorEastAsia" w:hAnsi="Times New Roman" w:cs="Times New Roman"/>
-          <w:sz w:val="24"/>
-          <w:szCs w:val="24"/>
-          <w:lang w:val="id-ID"/>
-        </w:rPr>
-        <w:t xml:space="preserve"> Teknik Robotika dan Kecerdasan buatan</w:t>
+        <w:t>Prodi Teknik Robotika dan Kecerdasan buatan</w:t>
       </w:r>
     </w:p>
     <w:p>
@@ -248,7 +206,47 @@
                     <w:sz w:val="24"/>
                     <w:szCs w:val="24"/>
                   </w:rPr>
-                  <m:t xml:space="preserve">x → ζ = 8,39416  .   .   .    </m:t>
+                  <m:t>x</m:t>
+                </m:r>
+                <m:r>
+                  <w:rPr>
+                    <w:rFonts w:ascii="Cambria Math" w:hAnsi="Cambria Math" w:cs="Times New Roman"/>
+                    <w:sz w:val="24"/>
+                    <w:szCs w:val="24"/>
+                  </w:rPr>
+                  <m:t xml:space="preserve"> → </m:t>
+                </m:r>
+                <m:r>
+                  <w:rPr>
+                    <w:rFonts w:ascii="Cambria Math" w:hAnsi="Cambria Math" w:cs="Times New Roman"/>
+                    <w:sz w:val="24"/>
+                    <w:szCs w:val="24"/>
+                  </w:rPr>
+                  <m:t>ζ</m:t>
+                </m:r>
+                <m:r>
+                  <w:rPr>
+                    <w:rFonts w:ascii="Cambria Math" w:hAnsi="Cambria Math" w:cs="Times New Roman"/>
+                    <w:sz w:val="24"/>
+                    <w:szCs w:val="24"/>
+                  </w:rPr>
+                  <m:t xml:space="preserve"> = 8,3</m:t>
+                </m:r>
+                <m:r>
+                  <w:rPr>
+                    <w:rFonts w:ascii="Cambria Math" w:hAnsi="Cambria Math" w:cs="Times New Roman"/>
+                    <w:sz w:val="24"/>
+                    <w:szCs w:val="24"/>
+                  </w:rPr>
+                  <m:t>2</m:t>
+                </m:r>
+                <m:r>
+                  <w:rPr>
+                    <w:rFonts w:ascii="Cambria Math" w:hAnsi="Cambria Math" w:cs="Times New Roman"/>
+                    <w:sz w:val="24"/>
+                    <w:szCs w:val="24"/>
+                  </w:rPr>
+                  <m:t xml:space="preserve">9416  .   .   .    </m:t>
                 </m:r>
                 <m:sSub>
                   <m:sSubPr>
@@ -350,7 +348,39 @@
                             <w:sz w:val="24"/>
                             <w:szCs w:val="24"/>
                           </w:rPr>
-                          <m:t xml:space="preserve">x → ζ = 8,39416  .   .   .    </m:t>
+                          <m:t>x</m:t>
+                        </m:r>
+                        <m:r>
+                          <w:rPr>
+                            <w:rFonts w:ascii="Cambria Math" w:hAnsi="Cambria Math" w:cs="Times New Roman"/>
+                            <w:sz w:val="24"/>
+                            <w:szCs w:val="24"/>
+                          </w:rPr>
+                          <m:t xml:space="preserve"> → </m:t>
+                        </m:r>
+                        <m:r>
+                          <w:rPr>
+                            <w:rFonts w:ascii="Cambria Math" w:hAnsi="Cambria Math" w:cs="Times New Roman"/>
+                            <w:sz w:val="24"/>
+                            <w:szCs w:val="24"/>
+                          </w:rPr>
+                          <m:t>ζ</m:t>
+                        </m:r>
+                        <m:r>
+                          <w:rPr>
+                            <w:rFonts w:ascii="Cambria Math" w:hAnsi="Cambria Math" w:cs="Times New Roman"/>
+                            <w:sz w:val="24"/>
+                            <w:szCs w:val="24"/>
+                          </w:rPr>
+                          <m:t xml:space="preserve"> = 8,32</m:t>
+                        </m:r>
+                        <m:r>
+                          <w:rPr>
+                            <w:rFonts w:ascii="Cambria Math" w:hAnsi="Cambria Math" w:cs="Times New Roman"/>
+                            <w:sz w:val="24"/>
+                            <w:szCs w:val="24"/>
+                          </w:rPr>
+                          <m:t xml:space="preserve">9416  .   .   .    </m:t>
                         </m:r>
                         <m:sSub>
                           <m:sSubPr>
@@ -440,7 +470,23 @@
                                 <w:sz w:val="24"/>
                                 <w:szCs w:val="24"/>
                               </w:rPr>
-                              <m:t>x-y</m:t>
+                              <m:t>x</m:t>
+                            </m:r>
+                            <m:r>
+                              <w:rPr>
+                                <w:rFonts w:ascii="Cambria Math" w:hAnsi="Cambria Math" w:cs="Times New Roman"/>
+                                <w:sz w:val="24"/>
+                                <w:szCs w:val="24"/>
+                              </w:rPr>
+                              <m:t>-</m:t>
+                            </m:r>
+                            <m:r>
+                              <w:rPr>
+                                <w:rFonts w:ascii="Cambria Math" w:hAnsi="Cambria Math" w:cs="Times New Roman"/>
+                                <w:sz w:val="24"/>
+                                <w:szCs w:val="24"/>
+                              </w:rPr>
+                              <m:t>y</m:t>
                             </m:r>
                           </m:e>
                         </m:d>
@@ -503,7 +549,47 @@
                     <w:sz w:val="24"/>
                     <w:szCs w:val="24"/>
                   </w:rPr>
-                  <m:t xml:space="preserve">x → ζ = 8,39416  .   .   .    </m:t>
+                  <m:t>x</m:t>
+                </m:r>
+                <m:r>
+                  <w:rPr>
+                    <w:rFonts w:ascii="Cambria Math" w:hAnsi="Cambria Math" w:cs="Times New Roman"/>
+                    <w:sz w:val="24"/>
+                    <w:szCs w:val="24"/>
+                  </w:rPr>
+                  <m:t xml:space="preserve"> →</m:t>
+                </m:r>
+                <m:r>
+                  <w:rPr>
+                    <w:rFonts w:ascii="Cambria Math" w:hAnsi="Cambria Math" w:cs="Times New Roman"/>
+                    <w:sz w:val="24"/>
+                    <w:szCs w:val="24"/>
+                  </w:rPr>
+                  <m:t xml:space="preserve"> </m:t>
+                </m:r>
+                <m:r>
+                  <w:rPr>
+                    <w:rFonts w:ascii="Cambria Math" w:hAnsi="Cambria Math" w:cs="Times New Roman"/>
+                    <w:sz w:val="24"/>
+                    <w:szCs w:val="24"/>
+                  </w:rPr>
+                  <m:t>ζ</m:t>
+                </m:r>
+                <m:r>
+                  <w:rPr>
+                    <w:rFonts w:ascii="Cambria Math" w:hAnsi="Cambria Math" w:cs="Times New Roman"/>
+                    <w:sz w:val="24"/>
+                    <w:szCs w:val="24"/>
+                  </w:rPr>
+                  <m:t xml:space="preserve"> = 8,32</m:t>
+                </m:r>
+                <m:r>
+                  <w:rPr>
+                    <w:rFonts w:ascii="Cambria Math" w:hAnsi="Cambria Math" w:cs="Times New Roman"/>
+                    <w:sz w:val="24"/>
+                    <w:szCs w:val="24"/>
+                  </w:rPr>
+                  <m:t xml:space="preserve">9416  .   .   .    </m:t>
                 </m:r>
                 <m:sSub>
                   <m:sSubPr>
@@ -605,7 +691,39 @@
                             <w:sz w:val="24"/>
                             <w:szCs w:val="24"/>
                           </w:rPr>
-                          <m:t xml:space="preserve">x → ζ = 8,39416  .   .   .    </m:t>
+                          <m:t>x</m:t>
+                        </m:r>
+                        <m:r>
+                          <w:rPr>
+                            <w:rFonts w:ascii="Cambria Math" w:hAnsi="Cambria Math" w:cs="Times New Roman"/>
+                            <w:sz w:val="24"/>
+                            <w:szCs w:val="24"/>
+                          </w:rPr>
+                          <m:t xml:space="preserve"> → </m:t>
+                        </m:r>
+                        <m:r>
+                          <w:rPr>
+                            <w:rFonts w:ascii="Cambria Math" w:hAnsi="Cambria Math" w:cs="Times New Roman"/>
+                            <w:sz w:val="24"/>
+                            <w:szCs w:val="24"/>
+                          </w:rPr>
+                          <m:t>ζ</m:t>
+                        </m:r>
+                        <m:r>
+                          <w:rPr>
+                            <w:rFonts w:ascii="Cambria Math" w:hAnsi="Cambria Math" w:cs="Times New Roman"/>
+                            <w:sz w:val="24"/>
+                            <w:szCs w:val="24"/>
+                          </w:rPr>
+                          <m:t xml:space="preserve"> = 8,32</m:t>
+                        </m:r>
+                        <m:r>
+                          <w:rPr>
+                            <w:rFonts w:ascii="Cambria Math" w:hAnsi="Cambria Math" w:cs="Times New Roman"/>
+                            <w:sz w:val="24"/>
+                            <w:szCs w:val="24"/>
+                          </w:rPr>
+                          <m:t xml:space="preserve">9416  .   .   .    </m:t>
                         </m:r>
                         <m:sSub>
                           <m:sSubPr>
@@ -881,7 +999,23 @@
                                                     <w:sz w:val="24"/>
                                                     <w:szCs w:val="24"/>
                                                   </w:rPr>
-                                                  <m:t>i=k</m:t>
+                                                  <m:t>i</m:t>
+                                                </m:r>
+                                                <m:r>
+                                                  <w:rPr>
+                                                    <w:rFonts w:ascii="Cambria Math" w:eastAsiaTheme="minorEastAsia" w:hAnsi="Cambria Math" w:cs="Times New Roman"/>
+                                                    <w:sz w:val="24"/>
+                                                    <w:szCs w:val="24"/>
+                                                  </w:rPr>
+                                                  <m:t>=</m:t>
+                                                </m:r>
+                                                <m:r>
+                                                  <w:rPr>
+                                                    <w:rFonts w:ascii="Cambria Math" w:eastAsiaTheme="minorEastAsia" w:hAnsi="Cambria Math" w:cs="Times New Roman"/>
+                                                    <w:sz w:val="24"/>
+                                                    <w:szCs w:val="24"/>
+                                                  </w:rPr>
+                                                  <m:t>k</m:t>
                                                 </m:r>
                                               </m:e>
                                             </m:d>
@@ -995,7 +1129,23 @@
                                                         <w:sz w:val="24"/>
                                                         <w:szCs w:val="24"/>
                                                       </w:rPr>
-                                                      <m:t>n - k</m:t>
+                                                      <m:t>n</m:t>
+                                                    </m:r>
+                                                    <m:r>
+                                                      <w:rPr>
+                                                        <w:rFonts w:ascii="Cambria Math" w:eastAsiaTheme="minorEastAsia" w:hAnsi="Cambria Math" w:cs="Times New Roman"/>
+                                                        <w:sz w:val="24"/>
+                                                        <w:szCs w:val="24"/>
+                                                      </w:rPr>
+                                                      <m:t xml:space="preserve"> - </m:t>
+                                                    </m:r>
+                                                    <m:r>
+                                                      <w:rPr>
+                                                        <w:rFonts w:ascii="Cambria Math" w:eastAsiaTheme="minorEastAsia" w:hAnsi="Cambria Math" w:cs="Times New Roman"/>
+                                                        <w:sz w:val="24"/>
+                                                        <w:szCs w:val="24"/>
+                                                      </w:rPr>
+                                                      <m:t>k</m:t>
                                                     </m:r>
                                                   </m:e>
                                                 </m:d>
@@ -1073,7 +1223,15 @@
                                                     <w:sz w:val="24"/>
                                                     <w:szCs w:val="24"/>
                                                   </w:rPr>
-                                                  <m:t xml:space="preserve"> y</m:t>
+                                                  <m:t xml:space="preserve"> </m:t>
+                                                </m:r>
+                                                <m:r>
+                                                  <w:rPr>
+                                                    <w:rFonts w:ascii="Cambria Math" w:eastAsiaTheme="minorEastAsia" w:hAnsi="Cambria Math" w:cs="Times New Roman"/>
+                                                    <w:sz w:val="24"/>
+                                                    <w:szCs w:val="24"/>
+                                                  </w:rPr>
+                                                  <m:t>y</m:t>
                                                 </m:r>
                                               </m:e>
                                               <m:sup>
@@ -1101,7 +1259,15 @@
                                 <w:sz w:val="24"/>
                                 <w:szCs w:val="24"/>
                               </w:rPr>
-                              <m:t xml:space="preserve">- </m:t>
+                              <m:t>-</m:t>
+                            </m:r>
+                            <m:r>
+                              <w:rPr>
+                                <w:rFonts w:ascii="Cambria Math" w:eastAsiaTheme="minorEastAsia" w:hAnsi="Cambria Math" w:cs="Times New Roman"/>
+                                <w:sz w:val="24"/>
+                                <w:szCs w:val="24"/>
+                              </w:rPr>
+                              <m:t xml:space="preserve"> </m:t>
                             </m:r>
                             <m:nary>
                               <m:naryPr>
@@ -1277,7 +1443,23 @@
                                             <w:sz w:val="24"/>
                                             <w:szCs w:val="24"/>
                                           </w:rPr>
-                                          <m:t>i=k</m:t>
+                                          <m:t>i</m:t>
+                                        </m:r>
+                                        <m:r>
+                                          <w:rPr>
+                                            <w:rFonts w:ascii="Cambria Math" w:eastAsiaTheme="minorEastAsia" w:hAnsi="Cambria Math" w:cs="Times New Roman"/>
+                                            <w:sz w:val="24"/>
+                                            <w:szCs w:val="24"/>
+                                          </w:rPr>
+                                          <m:t>=</m:t>
+                                        </m:r>
+                                        <m:r>
+                                          <w:rPr>
+                                            <w:rFonts w:ascii="Cambria Math" w:eastAsiaTheme="minorEastAsia" w:hAnsi="Cambria Math" w:cs="Times New Roman"/>
+                                            <w:sz w:val="24"/>
+                                            <w:szCs w:val="24"/>
+                                          </w:rPr>
+                                          <m:t>k</m:t>
                                         </m:r>
                                       </m:e>
                                     </m:d>
@@ -1391,7 +1573,23 @@
                                                 <w:sz w:val="24"/>
                                                 <w:szCs w:val="24"/>
                                               </w:rPr>
-                                              <m:t>n - k</m:t>
+                                              <m:t>n</m:t>
+                                            </m:r>
+                                            <m:r>
+                                              <w:rPr>
+                                                <w:rFonts w:ascii="Cambria Math" w:eastAsiaTheme="minorEastAsia" w:hAnsi="Cambria Math" w:cs="Times New Roman"/>
+                                                <w:sz w:val="24"/>
+                                                <w:szCs w:val="24"/>
+                                              </w:rPr>
+                                              <m:t xml:space="preserve"> - </m:t>
+                                            </m:r>
+                                            <m:r>
+                                              <w:rPr>
+                                                <w:rFonts w:ascii="Cambria Math" w:eastAsiaTheme="minorEastAsia" w:hAnsi="Cambria Math" w:cs="Times New Roman"/>
+                                                <w:sz w:val="24"/>
+                                                <w:szCs w:val="24"/>
+                                              </w:rPr>
+                                              <m:t>k</m:t>
                                             </m:r>
                                           </m:e>
                                         </m:d>
@@ -1469,7 +1667,15 @@
                                             <w:sz w:val="24"/>
                                             <w:szCs w:val="24"/>
                                           </w:rPr>
-                                          <m:t xml:space="preserve"> y</m:t>
+                                          <m:t xml:space="preserve"> </m:t>
+                                        </m:r>
+                                        <m:r>
+                                          <w:rPr>
+                                            <w:rFonts w:ascii="Cambria Math" w:eastAsiaTheme="minorEastAsia" w:hAnsi="Cambria Math" w:cs="Times New Roman"/>
+                                            <w:sz w:val="24"/>
+                                            <w:szCs w:val="24"/>
+                                          </w:rPr>
+                                          <m:t>y</m:t>
                                         </m:r>
                                       </m:e>
                                       <m:sup>
@@ -1930,11 +2136,11 @@
       <w14:ligatures w14:val="none"/>
     </w:rPr>
   </w:style>
-  <w:style w:type="paragraph" w:styleId="Judul1">
+  <w:style w:type="paragraph" w:styleId="Heading1">
     <w:name w:val="heading 1"/>
     <w:basedOn w:val="Normal"/>
     <w:next w:val="Normal"/>
-    <w:link w:val="Judul1KAR"/>
+    <w:link w:val="Heading1Char"/>
     <w:uiPriority w:val="9"/>
     <w:qFormat/>
     <w:rsid w:val="009212DA"/>
@@ -1954,11 +2160,11 @@
       <w14:ligatures w14:val="standardContextual"/>
     </w:rPr>
   </w:style>
-  <w:style w:type="paragraph" w:styleId="Judul2">
+  <w:style w:type="paragraph" w:styleId="Heading2">
     <w:name w:val="heading 2"/>
     <w:basedOn w:val="Normal"/>
     <w:next w:val="Normal"/>
-    <w:link w:val="Judul2KAR"/>
+    <w:link w:val="Heading2Char"/>
     <w:uiPriority w:val="9"/>
     <w:semiHidden/>
     <w:unhideWhenUsed/>
@@ -1980,11 +2186,11 @@
       <w14:ligatures w14:val="standardContextual"/>
     </w:rPr>
   </w:style>
-  <w:style w:type="paragraph" w:styleId="Judul3">
+  <w:style w:type="paragraph" w:styleId="Heading3">
     <w:name w:val="heading 3"/>
     <w:basedOn w:val="Normal"/>
     <w:next w:val="Normal"/>
-    <w:link w:val="Judul3KAR"/>
+    <w:link w:val="Heading3Char"/>
     <w:uiPriority w:val="9"/>
     <w:semiHidden/>
     <w:unhideWhenUsed/>
@@ -2006,11 +2212,11 @@
       <w14:ligatures w14:val="standardContextual"/>
     </w:rPr>
   </w:style>
-  <w:style w:type="paragraph" w:styleId="Judul4">
+  <w:style w:type="paragraph" w:styleId="Heading4">
     <w:name w:val="heading 4"/>
     <w:basedOn w:val="Normal"/>
     <w:next w:val="Normal"/>
-    <w:link w:val="Judul4KAR"/>
+    <w:link w:val="Heading4Char"/>
     <w:uiPriority w:val="9"/>
     <w:semiHidden/>
     <w:unhideWhenUsed/>
@@ -2034,11 +2240,11 @@
       <w14:ligatures w14:val="standardContextual"/>
     </w:rPr>
   </w:style>
-  <w:style w:type="paragraph" w:styleId="Judul5">
+  <w:style w:type="paragraph" w:styleId="Heading5">
     <w:name w:val="heading 5"/>
     <w:basedOn w:val="Normal"/>
     <w:next w:val="Normal"/>
-    <w:link w:val="Judul5KAR"/>
+    <w:link w:val="Heading5Char"/>
     <w:uiPriority w:val="9"/>
     <w:semiHidden/>
     <w:unhideWhenUsed/>
@@ -2060,11 +2266,11 @@
       <w14:ligatures w14:val="standardContextual"/>
     </w:rPr>
   </w:style>
-  <w:style w:type="paragraph" w:styleId="Judul6">
+  <w:style w:type="paragraph" w:styleId="Heading6">
     <w:name w:val="heading 6"/>
     <w:basedOn w:val="Normal"/>
     <w:next w:val="Normal"/>
-    <w:link w:val="Judul6KAR"/>
+    <w:link w:val="Heading6Char"/>
     <w:uiPriority w:val="9"/>
     <w:semiHidden/>
     <w:unhideWhenUsed/>
@@ -2088,11 +2294,11 @@
       <w14:ligatures w14:val="standardContextual"/>
     </w:rPr>
   </w:style>
-  <w:style w:type="paragraph" w:styleId="Judul7">
+  <w:style w:type="paragraph" w:styleId="Heading7">
     <w:name w:val="heading 7"/>
     <w:basedOn w:val="Normal"/>
     <w:next w:val="Normal"/>
-    <w:link w:val="Judul7KAR"/>
+    <w:link w:val="Heading7Char"/>
     <w:uiPriority w:val="9"/>
     <w:semiHidden/>
     <w:unhideWhenUsed/>
@@ -2114,11 +2320,11 @@
       <w14:ligatures w14:val="standardContextual"/>
     </w:rPr>
   </w:style>
-  <w:style w:type="paragraph" w:styleId="Judul8">
+  <w:style w:type="paragraph" w:styleId="Heading8">
     <w:name w:val="heading 8"/>
     <w:basedOn w:val="Normal"/>
     <w:next w:val="Normal"/>
-    <w:link w:val="Judul8KAR"/>
+    <w:link w:val="Heading8Char"/>
     <w:uiPriority w:val="9"/>
     <w:semiHidden/>
     <w:unhideWhenUsed/>
@@ -2142,11 +2348,11 @@
       <w14:ligatures w14:val="standardContextual"/>
     </w:rPr>
   </w:style>
-  <w:style w:type="paragraph" w:styleId="Judul9">
+  <w:style w:type="paragraph" w:styleId="Heading9">
     <w:name w:val="heading 9"/>
     <w:basedOn w:val="Normal"/>
     <w:next w:val="Normal"/>
-    <w:link w:val="Judul9KAR"/>
+    <w:link w:val="Heading9Char"/>
     <w:uiPriority w:val="9"/>
     <w:semiHidden/>
     <w:unhideWhenUsed/>
@@ -2168,13 +2374,13 @@
       <w14:ligatures w14:val="standardContextual"/>
     </w:rPr>
   </w:style>
-  <w:style w:type="character" w:default="1" w:styleId="FontParagrafDefault">
+  <w:style w:type="character" w:default="1" w:styleId="DefaultParagraphFont">
     <w:name w:val="Default Paragraph Font"/>
     <w:uiPriority w:val="1"/>
     <w:semiHidden/>
     <w:unhideWhenUsed/>
   </w:style>
-  <w:style w:type="table" w:default="1" w:styleId="TabelNormal">
+  <w:style w:type="table" w:default="1" w:styleId="TableNormal">
     <w:name w:val="Normal Table"/>
     <w:uiPriority w:val="99"/>
     <w:semiHidden/>
@@ -2189,16 +2395,16 @@
       </w:tblCellMar>
     </w:tblPr>
   </w:style>
-  <w:style w:type="numbering" w:default="1" w:styleId="TidakAdaDaftar">
+  <w:style w:type="numbering" w:default="1" w:styleId="NoList">
     <w:name w:val="No List"/>
     <w:uiPriority w:val="99"/>
     <w:semiHidden/>
     <w:unhideWhenUsed/>
   </w:style>
-  <w:style w:type="character" w:customStyle="1" w:styleId="Judul1KAR">
-    <w:name w:val="Judul 1 KAR"/>
-    <w:basedOn w:val="FontParagrafDefault"/>
-    <w:link w:val="Judul1"/>
+  <w:style w:type="character" w:customStyle="1" w:styleId="Heading1Char">
+    <w:name w:val="Heading 1 Char"/>
+    <w:basedOn w:val="DefaultParagraphFont"/>
+    <w:link w:val="Heading1"/>
     <w:uiPriority w:val="9"/>
     <w:rsid w:val="009212DA"/>
     <w:rPr>
@@ -2208,10 +2414,10 @@
       <w:szCs w:val="40"/>
     </w:rPr>
   </w:style>
-  <w:style w:type="character" w:customStyle="1" w:styleId="Judul2KAR">
-    <w:name w:val="Judul 2 KAR"/>
-    <w:basedOn w:val="FontParagrafDefault"/>
-    <w:link w:val="Judul2"/>
+  <w:style w:type="character" w:customStyle="1" w:styleId="Heading2Char">
+    <w:name w:val="Heading 2 Char"/>
+    <w:basedOn w:val="DefaultParagraphFont"/>
+    <w:link w:val="Heading2"/>
     <w:uiPriority w:val="9"/>
     <w:semiHidden/>
     <w:rsid w:val="009212DA"/>
@@ -2222,10 +2428,10 @@
       <w:szCs w:val="32"/>
     </w:rPr>
   </w:style>
-  <w:style w:type="character" w:customStyle="1" w:styleId="Judul3KAR">
-    <w:name w:val="Judul 3 KAR"/>
-    <w:basedOn w:val="FontParagrafDefault"/>
-    <w:link w:val="Judul3"/>
+  <w:style w:type="character" w:customStyle="1" w:styleId="Heading3Char">
+    <w:name w:val="Heading 3 Char"/>
+    <w:basedOn w:val="DefaultParagraphFont"/>
+    <w:link w:val="Heading3"/>
     <w:uiPriority w:val="9"/>
     <w:semiHidden/>
     <w:rsid w:val="009212DA"/>
@@ -2236,10 +2442,10 @@
       <w:szCs w:val="28"/>
     </w:rPr>
   </w:style>
-  <w:style w:type="character" w:customStyle="1" w:styleId="Judul4KAR">
-    <w:name w:val="Judul 4 KAR"/>
-    <w:basedOn w:val="FontParagrafDefault"/>
-    <w:link w:val="Judul4"/>
+  <w:style w:type="character" w:customStyle="1" w:styleId="Heading4Char">
+    <w:name w:val="Heading 4 Char"/>
+    <w:basedOn w:val="DefaultParagraphFont"/>
+    <w:link w:val="Heading4"/>
     <w:uiPriority w:val="9"/>
     <w:semiHidden/>
     <w:rsid w:val="009212DA"/>
@@ -2250,10 +2456,10 @@
       <w:color w:val="0F4761" w:themeColor="accent1" w:themeShade="BF"/>
     </w:rPr>
   </w:style>
-  <w:style w:type="character" w:customStyle="1" w:styleId="Judul5KAR">
-    <w:name w:val="Judul 5 KAR"/>
-    <w:basedOn w:val="FontParagrafDefault"/>
-    <w:link w:val="Judul5"/>
+  <w:style w:type="character" w:customStyle="1" w:styleId="Heading5Char">
+    <w:name w:val="Heading 5 Char"/>
+    <w:basedOn w:val="DefaultParagraphFont"/>
+    <w:link w:val="Heading5"/>
     <w:uiPriority w:val="9"/>
     <w:semiHidden/>
     <w:rsid w:val="009212DA"/>
@@ -2262,10 +2468,10 @@
       <w:color w:val="0F4761" w:themeColor="accent1" w:themeShade="BF"/>
     </w:rPr>
   </w:style>
-  <w:style w:type="character" w:customStyle="1" w:styleId="Judul6KAR">
-    <w:name w:val="Judul 6 KAR"/>
-    <w:basedOn w:val="FontParagrafDefault"/>
-    <w:link w:val="Judul6"/>
+  <w:style w:type="character" w:customStyle="1" w:styleId="Heading6Char">
+    <w:name w:val="Heading 6 Char"/>
+    <w:basedOn w:val="DefaultParagraphFont"/>
+    <w:link w:val="Heading6"/>
     <w:uiPriority w:val="9"/>
     <w:semiHidden/>
     <w:rsid w:val="009212DA"/>
@@ -2276,10 +2482,10 @@
       <w:color w:val="595959" w:themeColor="text1" w:themeTint="A6"/>
     </w:rPr>
   </w:style>
-  <w:style w:type="character" w:customStyle="1" w:styleId="Judul7KAR">
-    <w:name w:val="Judul 7 KAR"/>
-    <w:basedOn w:val="FontParagrafDefault"/>
-    <w:link w:val="Judul7"/>
+  <w:style w:type="character" w:customStyle="1" w:styleId="Heading7Char">
+    <w:name w:val="Heading 7 Char"/>
+    <w:basedOn w:val="DefaultParagraphFont"/>
+    <w:link w:val="Heading7"/>
     <w:uiPriority w:val="9"/>
     <w:semiHidden/>
     <w:rsid w:val="009212DA"/>
@@ -2288,10 +2494,10 @@
       <w:color w:val="595959" w:themeColor="text1" w:themeTint="A6"/>
     </w:rPr>
   </w:style>
-  <w:style w:type="character" w:customStyle="1" w:styleId="Judul8KAR">
-    <w:name w:val="Judul 8 KAR"/>
-    <w:basedOn w:val="FontParagrafDefault"/>
-    <w:link w:val="Judul8"/>
+  <w:style w:type="character" w:customStyle="1" w:styleId="Heading8Char">
+    <w:name w:val="Heading 8 Char"/>
+    <w:basedOn w:val="DefaultParagraphFont"/>
+    <w:link w:val="Heading8"/>
     <w:uiPriority w:val="9"/>
     <w:semiHidden/>
     <w:rsid w:val="009212DA"/>
@@ -2302,10 +2508,10 @@
       <w:color w:val="272727" w:themeColor="text1" w:themeTint="D8"/>
     </w:rPr>
   </w:style>
-  <w:style w:type="character" w:customStyle="1" w:styleId="Judul9KAR">
-    <w:name w:val="Judul 9 KAR"/>
-    <w:basedOn w:val="FontParagrafDefault"/>
-    <w:link w:val="Judul9"/>
+  <w:style w:type="character" w:customStyle="1" w:styleId="Heading9Char">
+    <w:name w:val="Heading 9 Char"/>
+    <w:basedOn w:val="DefaultParagraphFont"/>
+    <w:link w:val="Heading9"/>
     <w:uiPriority w:val="9"/>
     <w:semiHidden/>
     <w:rsid w:val="009212DA"/>
@@ -2314,11 +2520,11 @@
       <w:color w:val="272727" w:themeColor="text1" w:themeTint="D8"/>
     </w:rPr>
   </w:style>
-  <w:style w:type="paragraph" w:styleId="Judul">
+  <w:style w:type="paragraph" w:styleId="Title">
     <w:name w:val="Title"/>
     <w:basedOn w:val="Normal"/>
     <w:next w:val="Normal"/>
-    <w:link w:val="JudulKAR"/>
+    <w:link w:val="TitleChar"/>
     <w:uiPriority w:val="10"/>
     <w:qFormat/>
     <w:rsid w:val="009212DA"/>
@@ -2336,10 +2542,10 @@
       <w14:ligatures w14:val="standardContextual"/>
     </w:rPr>
   </w:style>
-  <w:style w:type="character" w:customStyle="1" w:styleId="JudulKAR">
-    <w:name w:val="Judul KAR"/>
-    <w:basedOn w:val="FontParagrafDefault"/>
-    <w:link w:val="Judul"/>
+  <w:style w:type="character" w:customStyle="1" w:styleId="TitleChar">
+    <w:name w:val="Title Char"/>
+    <w:basedOn w:val="DefaultParagraphFont"/>
+    <w:link w:val="Title"/>
     <w:uiPriority w:val="10"/>
     <w:rsid w:val="009212DA"/>
     <w:rPr>
@@ -2350,11 +2556,11 @@
       <w:szCs w:val="56"/>
     </w:rPr>
   </w:style>
-  <w:style w:type="paragraph" w:styleId="Subjudul">
+  <w:style w:type="paragraph" w:styleId="Subtitle">
     <w:name w:val="Subtitle"/>
     <w:basedOn w:val="Normal"/>
     <w:next w:val="Normal"/>
-    <w:link w:val="SubjudulKAR"/>
+    <w:link w:val="SubtitleChar"/>
     <w:uiPriority w:val="11"/>
     <w:qFormat/>
     <w:rsid w:val="009212DA"/>
@@ -2375,10 +2581,10 @@
       <w14:ligatures w14:val="standardContextual"/>
     </w:rPr>
   </w:style>
-  <w:style w:type="character" w:customStyle="1" w:styleId="SubjudulKAR">
-    <w:name w:val="Subjudul KAR"/>
-    <w:basedOn w:val="FontParagrafDefault"/>
-    <w:link w:val="Subjudul"/>
+  <w:style w:type="character" w:customStyle="1" w:styleId="SubtitleChar">
+    <w:name w:val="Subtitle Char"/>
+    <w:basedOn w:val="DefaultParagraphFont"/>
+    <w:link w:val="Subtitle"/>
     <w:uiPriority w:val="11"/>
     <w:rsid w:val="009212DA"/>
     <w:rPr>
@@ -2389,11 +2595,11 @@
       <w:szCs w:val="28"/>
     </w:rPr>
   </w:style>
-  <w:style w:type="paragraph" w:styleId="Kutipan">
+  <w:style w:type="paragraph" w:styleId="Quote">
     <w:name w:val="Quote"/>
     <w:basedOn w:val="Normal"/>
     <w:next w:val="Normal"/>
-    <w:link w:val="KutipanKAR"/>
+    <w:link w:val="QuoteChar"/>
     <w:uiPriority w:val="29"/>
     <w:qFormat/>
     <w:rsid w:val="009212DA"/>
@@ -2413,10 +2619,10 @@
       <w14:ligatures w14:val="standardContextual"/>
     </w:rPr>
   </w:style>
-  <w:style w:type="character" w:customStyle="1" w:styleId="KutipanKAR">
-    <w:name w:val="Kutipan KAR"/>
-    <w:basedOn w:val="FontParagrafDefault"/>
-    <w:link w:val="Kutipan"/>
+  <w:style w:type="character" w:customStyle="1" w:styleId="QuoteChar">
+    <w:name w:val="Quote Char"/>
+    <w:basedOn w:val="DefaultParagraphFont"/>
+    <w:link w:val="Quote"/>
     <w:uiPriority w:val="29"/>
     <w:rsid w:val="009212DA"/>
     <w:rPr>
@@ -2425,7 +2631,7 @@
       <w:color w:val="404040" w:themeColor="text1" w:themeTint="BF"/>
     </w:rPr>
   </w:style>
-  <w:style w:type="paragraph" w:styleId="DaftarParagraf">
+  <w:style w:type="paragraph" w:styleId="ListParagraph">
     <w:name w:val="List Paragraph"/>
     <w:basedOn w:val="Normal"/>
     <w:uiPriority w:val="34"/>
@@ -2445,9 +2651,9 @@
       <w14:ligatures w14:val="standardContextual"/>
     </w:rPr>
   </w:style>
-  <w:style w:type="character" w:styleId="PenekananKeras">
+  <w:style w:type="character" w:styleId="IntenseEmphasis">
     <w:name w:val="Intense Emphasis"/>
-    <w:basedOn w:val="FontParagrafDefault"/>
+    <w:basedOn w:val="DefaultParagraphFont"/>
     <w:uiPriority w:val="21"/>
     <w:qFormat/>
     <w:rsid w:val="009212DA"/>
@@ -2457,11 +2663,11 @@
       <w:color w:val="0F4761" w:themeColor="accent1" w:themeShade="BF"/>
     </w:rPr>
   </w:style>
-  <w:style w:type="paragraph" w:styleId="KutipanyangSering">
+  <w:style w:type="paragraph" w:styleId="IntenseQuote">
     <w:name w:val="Intense Quote"/>
     <w:basedOn w:val="Normal"/>
     <w:next w:val="Normal"/>
-    <w:link w:val="KutipanyangSeringKAR"/>
+    <w:link w:val="IntenseQuoteChar"/>
     <w:uiPriority w:val="30"/>
     <w:qFormat/>
     <w:rsid w:val="009212DA"/>
@@ -2486,10 +2692,10 @@
       <w14:ligatures w14:val="standardContextual"/>
     </w:rPr>
   </w:style>
-  <w:style w:type="character" w:customStyle="1" w:styleId="KutipanyangSeringKAR">
-    <w:name w:val="Kutipan yang Sering KAR"/>
-    <w:basedOn w:val="FontParagrafDefault"/>
-    <w:link w:val="KutipanyangSering"/>
+  <w:style w:type="character" w:customStyle="1" w:styleId="IntenseQuoteChar">
+    <w:name w:val="Intense Quote Char"/>
+    <w:basedOn w:val="DefaultParagraphFont"/>
+    <w:link w:val="IntenseQuote"/>
     <w:uiPriority w:val="30"/>
     <w:rsid w:val="009212DA"/>
     <w:rPr>
@@ -2498,9 +2704,9 @@
       <w:color w:val="0F4761" w:themeColor="accent1" w:themeShade="BF"/>
     </w:rPr>
   </w:style>
-  <w:style w:type="character" w:styleId="ReferensiyangSering">
+  <w:style w:type="character" w:styleId="IntenseReference">
     <w:name w:val="Intense Reference"/>
-    <w:basedOn w:val="FontParagrafDefault"/>
+    <w:basedOn w:val="DefaultParagraphFont"/>
     <w:uiPriority w:val="32"/>
     <w:qFormat/>
     <w:rsid w:val="009212DA"/>

</xml_diff>

<commit_message>
Rumus Perpangkatan Universal 4.0 || (21:13 (W . I . B[Waktu Indonesia bagian Barat]), 24/09/2026), Batam, Kepulauan Riau, Indonesia || #NOBELSNOINDONESIANYES #LAWANPEMERINTAHINDONESIAKORUPPENINDASRAKYATINDONESIADENGANPENGETAHUAN #LAWANKEMISKINANDENGANPENDIDIKAN #HIDUPMAHASISWA #HIDUPRAKYATINDONESIA #HIDUPWANGSAINDONESIA #17081945
Rumus Perpangkatan Universal 4.0 || (21:13 (W . I . B[Waktu Indonesia bagian Barat]), 24/09/2026), Batam, Kepulauan Riau, Indonesia || #NOBELSNOINDONESIANYES #LAWANPEMERINTAHINDONESIAKORUPPENINDASRAKYATINDONESIADENGANPENGETAHUAN #LAWANKEMISKINANDENGANPENDIDIKAN #HIDUPMAHASISWA #HIDUPRAKYATINDONESIA #HIDUPWANGSAINDONESIA #17081945
</commit_message>
<xml_diff>
--- a/Rumus Perpangkatan Universal 4.0.docx
+++ b/Rumus Perpangkatan Universal 4.0.docx
@@ -206,50 +206,10 @@
                     <w:sz w:val="24"/>
                     <w:szCs w:val="24"/>
                   </w:rPr>
-                  <m:t>x</m:t>
+                  <m:t xml:space="preserve">x → ζ = </m:t>
                 </m:r>
-                <m:r>
-                  <w:rPr>
-                    <w:rFonts w:ascii="Cambria Math" w:hAnsi="Cambria Math" w:cs="Times New Roman"/>
-                    <w:sz w:val="24"/>
-                    <w:szCs w:val="24"/>
-                  </w:rPr>
-                  <m:t xml:space="preserve"> → </m:t>
-                </m:r>
-                <m:r>
-                  <w:rPr>
-                    <w:rFonts w:ascii="Cambria Math" w:hAnsi="Cambria Math" w:cs="Times New Roman"/>
-                    <w:sz w:val="24"/>
-                    <w:szCs w:val="24"/>
-                  </w:rPr>
-                  <m:t>ζ</m:t>
-                </m:r>
-                <m:r>
-                  <w:rPr>
-                    <w:rFonts w:ascii="Cambria Math" w:hAnsi="Cambria Math" w:cs="Times New Roman"/>
-                    <w:sz w:val="24"/>
-                    <w:szCs w:val="24"/>
-                  </w:rPr>
-                  <m:t xml:space="preserve"> = 8,3</m:t>
-                </m:r>
-                <m:r>
-                  <w:rPr>
-                    <w:rFonts w:ascii="Cambria Math" w:hAnsi="Cambria Math" w:cs="Times New Roman"/>
-                    <w:sz w:val="24"/>
-                    <w:szCs w:val="24"/>
-                  </w:rPr>
-                  <m:t>2</m:t>
-                </m:r>
-                <m:r>
-                  <w:rPr>
-                    <w:rFonts w:ascii="Cambria Math" w:hAnsi="Cambria Math" w:cs="Times New Roman"/>
-                    <w:sz w:val="24"/>
-                    <w:szCs w:val="24"/>
-                  </w:rPr>
-                  <m:t xml:space="preserve">9416  .   .   .    </m:t>
-                </m:r>
-                <m:sSub>
-                  <m:sSubPr>
+                <m:d>
+                  <m:dPr>
                     <m:ctrlPr>
                       <w:rPr>
                         <w:rFonts w:ascii="Cambria Math" w:hAnsi="Cambria Math" w:cs="Times New Roman"/>
@@ -258,7 +218,7 @@
                         <w:szCs w:val="24"/>
                       </w:rPr>
                     </m:ctrlPr>
-                  </m:sSubPr>
+                  </m:dPr>
                   <m:e>
                     <m:r>
                       <w:rPr>
@@ -266,28 +226,50 @@
                         <w:sz w:val="24"/>
                         <w:szCs w:val="24"/>
                       </w:rPr>
-                      <m:t>6</m:t>
+                      <m:t xml:space="preserve"> -8,329416  .   .   .    </m:t>
                     </m:r>
-                  </m:e>
-                  <m:sub>
+                    <m:sSub>
+                      <m:sSubPr>
+                        <m:ctrlPr>
+                          <w:rPr>
+                            <w:rFonts w:ascii="Cambria Math" w:hAnsi="Cambria Math" w:cs="Times New Roman"/>
+                            <w:i/>
+                            <w:sz w:val="24"/>
+                            <w:szCs w:val="24"/>
+                          </w:rPr>
+                        </m:ctrlPr>
+                      </m:sSubPr>
+                      <m:e>
+                        <m:r>
+                          <w:rPr>
+                            <w:rFonts w:ascii="Cambria Math" w:hAnsi="Cambria Math" w:cs="Times New Roman"/>
+                            <w:sz w:val="24"/>
+                            <w:szCs w:val="24"/>
+                          </w:rPr>
+                          <m:t>6</m:t>
+                        </m:r>
+                      </m:e>
+                      <m:sub>
+                        <m:r>
+                          <w:rPr>
+                            <w:rFonts w:ascii="Cambria Math" w:hAnsi="Cambria Math" w:cs="Times New Roman"/>
+                            <w:sz w:val="24"/>
+                            <w:szCs w:val="24"/>
+                          </w:rPr>
+                          <m:t>n</m:t>
+                        </m:r>
+                      </m:sub>
+                    </m:sSub>
                     <m:r>
                       <w:rPr>
                         <w:rFonts w:ascii="Cambria Math" w:hAnsi="Cambria Math" w:cs="Times New Roman"/>
                         <w:sz w:val="24"/>
                         <w:szCs w:val="24"/>
                       </w:rPr>
-                      <m:t>n</m:t>
+                      <m:t>%</m:t>
                     </m:r>
-                  </m:sub>
-                </m:sSub>
-                <m:r>
-                  <w:rPr>
-                    <w:rFonts w:ascii="Cambria Math" w:hAnsi="Cambria Math" w:cs="Times New Roman"/>
-                    <w:sz w:val="24"/>
-                    <w:szCs w:val="24"/>
-                  </w:rPr>
-                  <m:t>%</m:t>
-                </m:r>
+                  </m:e>
+                </m:d>
               </m:e>
             </m:d>
           </m:sub>
@@ -348,42 +330,10 @@
                             <w:sz w:val="24"/>
                             <w:szCs w:val="24"/>
                           </w:rPr>
-                          <m:t>x</m:t>
+                          <m:t xml:space="preserve">x → ζ = </m:t>
                         </m:r>
-                        <m:r>
-                          <w:rPr>
-                            <w:rFonts w:ascii="Cambria Math" w:hAnsi="Cambria Math" w:cs="Times New Roman"/>
-                            <w:sz w:val="24"/>
-                            <w:szCs w:val="24"/>
-                          </w:rPr>
-                          <m:t xml:space="preserve"> → </m:t>
-                        </m:r>
-                        <m:r>
-                          <w:rPr>
-                            <w:rFonts w:ascii="Cambria Math" w:hAnsi="Cambria Math" w:cs="Times New Roman"/>
-                            <w:sz w:val="24"/>
-                            <w:szCs w:val="24"/>
-                          </w:rPr>
-                          <m:t>ζ</m:t>
-                        </m:r>
-                        <m:r>
-                          <w:rPr>
-                            <w:rFonts w:ascii="Cambria Math" w:hAnsi="Cambria Math" w:cs="Times New Roman"/>
-                            <w:sz w:val="24"/>
-                            <w:szCs w:val="24"/>
-                          </w:rPr>
-                          <m:t xml:space="preserve"> = 8,32</m:t>
-                        </m:r>
-                        <m:r>
-                          <w:rPr>
-                            <w:rFonts w:ascii="Cambria Math" w:hAnsi="Cambria Math" w:cs="Times New Roman"/>
-                            <w:sz w:val="24"/>
-                            <w:szCs w:val="24"/>
-                          </w:rPr>
-                          <m:t xml:space="preserve">9416  .   .   .    </m:t>
-                        </m:r>
-                        <m:sSub>
-                          <m:sSubPr>
+                        <m:d>
+                          <m:dPr>
                             <m:ctrlPr>
                               <w:rPr>
                                 <w:rFonts w:ascii="Cambria Math" w:hAnsi="Cambria Math" w:cs="Times New Roman"/>
@@ -392,7 +342,7 @@
                                 <w:szCs w:val="24"/>
                               </w:rPr>
                             </m:ctrlPr>
-                          </m:sSubPr>
+                          </m:dPr>
                           <m:e>
                             <m:r>
                               <w:rPr>
@@ -400,28 +350,50 @@
                                 <w:sz w:val="24"/>
                                 <w:szCs w:val="24"/>
                               </w:rPr>
-                              <m:t>6</m:t>
+                              <m:t xml:space="preserve"> -8,329416  .   .   .    </m:t>
                             </m:r>
-                          </m:e>
-                          <m:sub>
+                            <m:sSub>
+                              <m:sSubPr>
+                                <m:ctrlPr>
+                                  <w:rPr>
+                                    <w:rFonts w:ascii="Cambria Math" w:hAnsi="Cambria Math" w:cs="Times New Roman"/>
+                                    <w:i/>
+                                    <w:sz w:val="24"/>
+                                    <w:szCs w:val="24"/>
+                                  </w:rPr>
+                                </m:ctrlPr>
+                              </m:sSubPr>
+                              <m:e>
+                                <m:r>
+                                  <w:rPr>
+                                    <w:rFonts w:ascii="Cambria Math" w:hAnsi="Cambria Math" w:cs="Times New Roman"/>
+                                    <w:sz w:val="24"/>
+                                    <w:szCs w:val="24"/>
+                                  </w:rPr>
+                                  <m:t>6</m:t>
+                                </m:r>
+                              </m:e>
+                              <m:sub>
+                                <m:r>
+                                  <w:rPr>
+                                    <w:rFonts w:ascii="Cambria Math" w:hAnsi="Cambria Math" w:cs="Times New Roman"/>
+                                    <w:sz w:val="24"/>
+                                    <w:szCs w:val="24"/>
+                                  </w:rPr>
+                                  <m:t>n</m:t>
+                                </m:r>
+                              </m:sub>
+                            </m:sSub>
                             <m:r>
                               <w:rPr>
                                 <w:rFonts w:ascii="Cambria Math" w:hAnsi="Cambria Math" w:cs="Times New Roman"/>
                                 <w:sz w:val="24"/>
                                 <w:szCs w:val="24"/>
                               </w:rPr>
-                              <m:t>n</m:t>
+                              <m:t>%</m:t>
                             </m:r>
-                          </m:sub>
-                        </m:sSub>
-                        <m:r>
-                          <w:rPr>
-                            <w:rFonts w:ascii="Cambria Math" w:hAnsi="Cambria Math" w:cs="Times New Roman"/>
-                            <w:sz w:val="24"/>
-                            <w:szCs w:val="24"/>
-                          </w:rPr>
-                          <m:t>%</m:t>
-                        </m:r>
+                          </m:e>
+                        </m:d>
                       </m:e>
                     </m:d>
                   </m:lim>
@@ -470,23 +442,7 @@
                                 <w:sz w:val="24"/>
                                 <w:szCs w:val="24"/>
                               </w:rPr>
-                              <m:t>x</m:t>
-                            </m:r>
-                            <m:r>
-                              <w:rPr>
-                                <w:rFonts w:ascii="Cambria Math" w:hAnsi="Cambria Math" w:cs="Times New Roman"/>
-                                <w:sz w:val="24"/>
-                                <w:szCs w:val="24"/>
-                              </w:rPr>
-                              <m:t>-</m:t>
-                            </m:r>
-                            <m:r>
-                              <w:rPr>
-                                <w:rFonts w:ascii="Cambria Math" w:hAnsi="Cambria Math" w:cs="Times New Roman"/>
-                                <w:sz w:val="24"/>
-                                <w:szCs w:val="24"/>
-                              </w:rPr>
-                              <m:t>y</m:t>
+                              <m:t>x-y</m:t>
                             </m:r>
                           </m:e>
                         </m:d>
@@ -549,50 +505,10 @@
                     <w:sz w:val="24"/>
                     <w:szCs w:val="24"/>
                   </w:rPr>
-                  <m:t>x</m:t>
+                  <m:t xml:space="preserve">x → ζ = </m:t>
                 </m:r>
-                <m:r>
-                  <w:rPr>
-                    <w:rFonts w:ascii="Cambria Math" w:hAnsi="Cambria Math" w:cs="Times New Roman"/>
-                    <w:sz w:val="24"/>
-                    <w:szCs w:val="24"/>
-                  </w:rPr>
-                  <m:t xml:space="preserve"> →</m:t>
-                </m:r>
-                <m:r>
-                  <w:rPr>
-                    <w:rFonts w:ascii="Cambria Math" w:hAnsi="Cambria Math" w:cs="Times New Roman"/>
-                    <w:sz w:val="24"/>
-                    <w:szCs w:val="24"/>
-                  </w:rPr>
-                  <m:t xml:space="preserve"> </m:t>
-                </m:r>
-                <m:r>
-                  <w:rPr>
-                    <w:rFonts w:ascii="Cambria Math" w:hAnsi="Cambria Math" w:cs="Times New Roman"/>
-                    <w:sz w:val="24"/>
-                    <w:szCs w:val="24"/>
-                  </w:rPr>
-                  <m:t>ζ</m:t>
-                </m:r>
-                <m:r>
-                  <w:rPr>
-                    <w:rFonts w:ascii="Cambria Math" w:hAnsi="Cambria Math" w:cs="Times New Roman"/>
-                    <w:sz w:val="24"/>
-                    <w:szCs w:val="24"/>
-                  </w:rPr>
-                  <m:t xml:space="preserve"> = 8,32</m:t>
-                </m:r>
-                <m:r>
-                  <w:rPr>
-                    <w:rFonts w:ascii="Cambria Math" w:hAnsi="Cambria Math" w:cs="Times New Roman"/>
-                    <w:sz w:val="24"/>
-                    <w:szCs w:val="24"/>
-                  </w:rPr>
-                  <m:t xml:space="preserve">9416  .   .   .    </m:t>
-                </m:r>
-                <m:sSub>
-                  <m:sSubPr>
+                <m:d>
+                  <m:dPr>
                     <m:ctrlPr>
                       <w:rPr>
                         <w:rFonts w:ascii="Cambria Math" w:hAnsi="Cambria Math" w:cs="Times New Roman"/>
@@ -601,7 +517,7 @@
                         <w:szCs w:val="24"/>
                       </w:rPr>
                     </m:ctrlPr>
-                  </m:sSubPr>
+                  </m:dPr>
                   <m:e>
                     <m:r>
                       <w:rPr>
@@ -609,28 +525,50 @@
                         <w:sz w:val="24"/>
                         <w:szCs w:val="24"/>
                       </w:rPr>
-                      <m:t>6</m:t>
+                      <m:t xml:space="preserve"> -8,329416  .   .   .    </m:t>
                     </m:r>
-                  </m:e>
-                  <m:sub>
+                    <m:sSub>
+                      <m:sSubPr>
+                        <m:ctrlPr>
+                          <w:rPr>
+                            <w:rFonts w:ascii="Cambria Math" w:hAnsi="Cambria Math" w:cs="Times New Roman"/>
+                            <w:i/>
+                            <w:sz w:val="24"/>
+                            <w:szCs w:val="24"/>
+                          </w:rPr>
+                        </m:ctrlPr>
+                      </m:sSubPr>
+                      <m:e>
+                        <m:r>
+                          <w:rPr>
+                            <w:rFonts w:ascii="Cambria Math" w:hAnsi="Cambria Math" w:cs="Times New Roman"/>
+                            <w:sz w:val="24"/>
+                            <w:szCs w:val="24"/>
+                          </w:rPr>
+                          <m:t>6</m:t>
+                        </m:r>
+                      </m:e>
+                      <m:sub>
+                        <m:r>
+                          <w:rPr>
+                            <w:rFonts w:ascii="Cambria Math" w:hAnsi="Cambria Math" w:cs="Times New Roman"/>
+                            <w:sz w:val="24"/>
+                            <w:szCs w:val="24"/>
+                          </w:rPr>
+                          <m:t>n</m:t>
+                        </m:r>
+                      </m:sub>
+                    </m:sSub>
                     <m:r>
                       <w:rPr>
                         <w:rFonts w:ascii="Cambria Math" w:hAnsi="Cambria Math" w:cs="Times New Roman"/>
                         <w:sz w:val="24"/>
                         <w:szCs w:val="24"/>
                       </w:rPr>
-                      <m:t>n</m:t>
+                      <m:t>%</m:t>
                     </m:r>
-                  </m:sub>
-                </m:sSub>
-                <m:r>
-                  <w:rPr>
-                    <w:rFonts w:ascii="Cambria Math" w:hAnsi="Cambria Math" w:cs="Times New Roman"/>
-                    <w:sz w:val="24"/>
-                    <w:szCs w:val="24"/>
-                  </w:rPr>
-                  <m:t>%</m:t>
-                </m:r>
+                  </m:e>
+                </m:d>
               </m:e>
             </m:d>
           </m:sub>
@@ -691,42 +629,10 @@
                             <w:sz w:val="24"/>
                             <w:szCs w:val="24"/>
                           </w:rPr>
-                          <m:t>x</m:t>
+                          <m:t xml:space="preserve">x → ζ = </m:t>
                         </m:r>
-                        <m:r>
-                          <w:rPr>
-                            <w:rFonts w:ascii="Cambria Math" w:hAnsi="Cambria Math" w:cs="Times New Roman"/>
-                            <w:sz w:val="24"/>
-                            <w:szCs w:val="24"/>
-                          </w:rPr>
-                          <m:t xml:space="preserve"> → </m:t>
-                        </m:r>
-                        <m:r>
-                          <w:rPr>
-                            <w:rFonts w:ascii="Cambria Math" w:hAnsi="Cambria Math" w:cs="Times New Roman"/>
-                            <w:sz w:val="24"/>
-                            <w:szCs w:val="24"/>
-                          </w:rPr>
-                          <m:t>ζ</m:t>
-                        </m:r>
-                        <m:r>
-                          <w:rPr>
-                            <w:rFonts w:ascii="Cambria Math" w:hAnsi="Cambria Math" w:cs="Times New Roman"/>
-                            <w:sz w:val="24"/>
-                            <w:szCs w:val="24"/>
-                          </w:rPr>
-                          <m:t xml:space="preserve"> = 8,32</m:t>
-                        </m:r>
-                        <m:r>
-                          <w:rPr>
-                            <w:rFonts w:ascii="Cambria Math" w:hAnsi="Cambria Math" w:cs="Times New Roman"/>
-                            <w:sz w:val="24"/>
-                            <w:szCs w:val="24"/>
-                          </w:rPr>
-                          <m:t xml:space="preserve">9416  .   .   .    </m:t>
-                        </m:r>
-                        <m:sSub>
-                          <m:sSubPr>
+                        <m:d>
+                          <m:dPr>
                             <m:ctrlPr>
                               <w:rPr>
                                 <w:rFonts w:ascii="Cambria Math" w:hAnsi="Cambria Math" w:cs="Times New Roman"/>
@@ -735,7 +641,7 @@
                                 <w:szCs w:val="24"/>
                               </w:rPr>
                             </m:ctrlPr>
-                          </m:sSubPr>
+                          </m:dPr>
                           <m:e>
                             <m:r>
                               <w:rPr>
@@ -743,28 +649,50 @@
                                 <w:sz w:val="24"/>
                                 <w:szCs w:val="24"/>
                               </w:rPr>
-                              <m:t>6</m:t>
+                              <m:t xml:space="preserve"> -8,329416  .   .   .    </m:t>
                             </m:r>
-                          </m:e>
-                          <m:sub>
+                            <m:sSub>
+                              <m:sSubPr>
+                                <m:ctrlPr>
+                                  <w:rPr>
+                                    <w:rFonts w:ascii="Cambria Math" w:hAnsi="Cambria Math" w:cs="Times New Roman"/>
+                                    <w:i/>
+                                    <w:sz w:val="24"/>
+                                    <w:szCs w:val="24"/>
+                                  </w:rPr>
+                                </m:ctrlPr>
+                              </m:sSubPr>
+                              <m:e>
+                                <m:r>
+                                  <w:rPr>
+                                    <w:rFonts w:ascii="Cambria Math" w:hAnsi="Cambria Math" w:cs="Times New Roman"/>
+                                    <w:sz w:val="24"/>
+                                    <w:szCs w:val="24"/>
+                                  </w:rPr>
+                                  <m:t>6</m:t>
+                                </m:r>
+                              </m:e>
+                              <m:sub>
+                                <m:r>
+                                  <w:rPr>
+                                    <w:rFonts w:ascii="Cambria Math" w:hAnsi="Cambria Math" w:cs="Times New Roman"/>
+                                    <w:sz w:val="24"/>
+                                    <w:szCs w:val="24"/>
+                                  </w:rPr>
+                                  <m:t>n</m:t>
+                                </m:r>
+                              </m:sub>
+                            </m:sSub>
                             <m:r>
                               <w:rPr>
                                 <w:rFonts w:ascii="Cambria Math" w:hAnsi="Cambria Math" w:cs="Times New Roman"/>
                                 <w:sz w:val="24"/>
                                 <w:szCs w:val="24"/>
                               </w:rPr>
-                              <m:t>n</m:t>
+                              <m:t>%</m:t>
                             </m:r>
-                          </m:sub>
-                        </m:sSub>
-                        <m:r>
-                          <w:rPr>
-                            <w:rFonts w:ascii="Cambria Math" w:hAnsi="Cambria Math" w:cs="Times New Roman"/>
-                            <w:sz w:val="24"/>
-                            <w:szCs w:val="24"/>
-                          </w:rPr>
-                          <m:t>%</m:t>
-                        </m:r>
+                          </m:e>
+                        </m:d>
                       </m:e>
                     </m:d>
                   </m:lim>
@@ -999,23 +927,7 @@
                                                     <w:sz w:val="24"/>
                                                     <w:szCs w:val="24"/>
                                                   </w:rPr>
-                                                  <m:t>i</m:t>
-                                                </m:r>
-                                                <m:r>
-                                                  <w:rPr>
-                                                    <w:rFonts w:ascii="Cambria Math" w:eastAsiaTheme="minorEastAsia" w:hAnsi="Cambria Math" w:cs="Times New Roman"/>
-                                                    <w:sz w:val="24"/>
-                                                    <w:szCs w:val="24"/>
-                                                  </w:rPr>
-                                                  <m:t>=</m:t>
-                                                </m:r>
-                                                <m:r>
-                                                  <w:rPr>
-                                                    <w:rFonts w:ascii="Cambria Math" w:eastAsiaTheme="minorEastAsia" w:hAnsi="Cambria Math" w:cs="Times New Roman"/>
-                                                    <w:sz w:val="24"/>
-                                                    <w:szCs w:val="24"/>
-                                                  </w:rPr>
-                                                  <m:t>k</m:t>
+                                                  <m:t>i=k</m:t>
                                                 </m:r>
                                               </m:e>
                                             </m:d>
@@ -1129,23 +1041,7 @@
                                                         <w:sz w:val="24"/>
                                                         <w:szCs w:val="24"/>
                                                       </w:rPr>
-                                                      <m:t>n</m:t>
-                                                    </m:r>
-                                                    <m:r>
-                                                      <w:rPr>
-                                                        <w:rFonts w:ascii="Cambria Math" w:eastAsiaTheme="minorEastAsia" w:hAnsi="Cambria Math" w:cs="Times New Roman"/>
-                                                        <w:sz w:val="24"/>
-                                                        <w:szCs w:val="24"/>
-                                                      </w:rPr>
-                                                      <m:t xml:space="preserve"> - </m:t>
-                                                    </m:r>
-                                                    <m:r>
-                                                      <w:rPr>
-                                                        <w:rFonts w:ascii="Cambria Math" w:eastAsiaTheme="minorEastAsia" w:hAnsi="Cambria Math" w:cs="Times New Roman"/>
-                                                        <w:sz w:val="24"/>
-                                                        <w:szCs w:val="24"/>
-                                                      </w:rPr>
-                                                      <m:t>k</m:t>
+                                                      <m:t>n - k</m:t>
                                                     </m:r>
                                                   </m:e>
                                                 </m:d>
@@ -1223,15 +1119,7 @@
                                                     <w:sz w:val="24"/>
                                                     <w:szCs w:val="24"/>
                                                   </w:rPr>
-                                                  <m:t xml:space="preserve"> </m:t>
-                                                </m:r>
-                                                <m:r>
-                                                  <w:rPr>
-                                                    <w:rFonts w:ascii="Cambria Math" w:eastAsiaTheme="minorEastAsia" w:hAnsi="Cambria Math" w:cs="Times New Roman"/>
-                                                    <w:sz w:val="24"/>
-                                                    <w:szCs w:val="24"/>
-                                                  </w:rPr>
-                                                  <m:t>y</m:t>
+                                                  <m:t xml:space="preserve"> y</m:t>
                                                 </m:r>
                                               </m:e>
                                               <m:sup>
@@ -1259,15 +1147,7 @@
                                 <w:sz w:val="24"/>
                                 <w:szCs w:val="24"/>
                               </w:rPr>
-                              <m:t>-</m:t>
-                            </m:r>
-                            <m:r>
-                              <w:rPr>
-                                <w:rFonts w:ascii="Cambria Math" w:eastAsiaTheme="minorEastAsia" w:hAnsi="Cambria Math" w:cs="Times New Roman"/>
-                                <w:sz w:val="24"/>
-                                <w:szCs w:val="24"/>
-                              </w:rPr>
-                              <m:t xml:space="preserve"> </m:t>
+                              <m:t xml:space="preserve">- </m:t>
                             </m:r>
                             <m:nary>
                               <m:naryPr>
@@ -1443,23 +1323,7 @@
                                             <w:sz w:val="24"/>
                                             <w:szCs w:val="24"/>
                                           </w:rPr>
-                                          <m:t>i</m:t>
-                                        </m:r>
-                                        <m:r>
-                                          <w:rPr>
-                                            <w:rFonts w:ascii="Cambria Math" w:eastAsiaTheme="minorEastAsia" w:hAnsi="Cambria Math" w:cs="Times New Roman"/>
-                                            <w:sz w:val="24"/>
-                                            <w:szCs w:val="24"/>
-                                          </w:rPr>
-                                          <m:t>=</m:t>
-                                        </m:r>
-                                        <m:r>
-                                          <w:rPr>
-                                            <w:rFonts w:ascii="Cambria Math" w:eastAsiaTheme="minorEastAsia" w:hAnsi="Cambria Math" w:cs="Times New Roman"/>
-                                            <w:sz w:val="24"/>
-                                            <w:szCs w:val="24"/>
-                                          </w:rPr>
-                                          <m:t>k</m:t>
+                                          <m:t>i=k</m:t>
                                         </m:r>
                                       </m:e>
                                     </m:d>
@@ -1573,23 +1437,7 @@
                                                 <w:sz w:val="24"/>
                                                 <w:szCs w:val="24"/>
                                               </w:rPr>
-                                              <m:t>n</m:t>
-                                            </m:r>
-                                            <m:r>
-                                              <w:rPr>
-                                                <w:rFonts w:ascii="Cambria Math" w:eastAsiaTheme="minorEastAsia" w:hAnsi="Cambria Math" w:cs="Times New Roman"/>
-                                                <w:sz w:val="24"/>
-                                                <w:szCs w:val="24"/>
-                                              </w:rPr>
-                                              <m:t xml:space="preserve"> - </m:t>
-                                            </m:r>
-                                            <m:r>
-                                              <w:rPr>
-                                                <w:rFonts w:ascii="Cambria Math" w:eastAsiaTheme="minorEastAsia" w:hAnsi="Cambria Math" w:cs="Times New Roman"/>
-                                                <w:sz w:val="24"/>
-                                                <w:szCs w:val="24"/>
-                                              </w:rPr>
-                                              <m:t>k</m:t>
+                                              <m:t>n - k</m:t>
                                             </m:r>
                                           </m:e>
                                         </m:d>
@@ -1667,15 +1515,7 @@
                                             <w:sz w:val="24"/>
                                             <w:szCs w:val="24"/>
                                           </w:rPr>
-                                          <m:t xml:space="preserve"> </m:t>
-                                        </m:r>
-                                        <m:r>
-                                          <w:rPr>
-                                            <w:rFonts w:ascii="Cambria Math" w:eastAsiaTheme="minorEastAsia" w:hAnsi="Cambria Math" w:cs="Times New Roman"/>
-                                            <w:sz w:val="24"/>
-                                            <w:szCs w:val="24"/>
-                                          </w:rPr>
-                                          <m:t>y</m:t>
+                                          <m:t xml:space="preserve"> y</m:t>
                                         </m:r>
                                       </m:e>
                                       <m:sup>

</xml_diff>

<commit_message>
Rumus Perpangkatan Universal 4.0 || (15:26 (W . I . B[Waktu Indonesia bagian Barat]), 08/10/2026), Jakarta Barat, Daerah Khusus Indonesia (DKI) Jakarta, Indonesia || #NOBELSNOINDONESIANYES #LAWANPEMERINTAHINDONESIAKORUPPENINDASRAKYATINDONESIADENGANPENGETAHUAN #LAWANKEMISKINANDENGANPENDIDIKAN #HIDUPMAHASISWA #HIDUPRAKYATINDONESIA #HIDUPWANGSAINDONESIA #17081945
Rumus Perpangkatan Universal 4.0 || (15:26 (W . I . B[Waktu Indonesia bagian Barat]), 08/10/2026), Jakarta Barat, Daerah Khusus Indonesia (DKI) Jakarta, Indonesia || #NOBELSNOINDONESIANYES #LAWANPEMERINTAHINDONESIAKORUPPENINDASRAKYATINDONESIADENGANPENGETAHUAN #LAWANKEMISKINANDENGANPENDIDIKAN #HIDUPMAHASISWA #HIDUPRAKYATINDONESIA #HIDUPWANGSAINDONESIA #17081945
</commit_message>
<xml_diff>
--- a/Rumus Perpangkatan Universal 4.0.docx
+++ b/Rumus Perpangkatan Universal 4.0.docx
@@ -226,7 +226,23 @@
                         <w:sz w:val="24"/>
                         <w:szCs w:val="24"/>
                       </w:rPr>
-                      <m:t xml:space="preserve"> -8,329416  .   .   .    </m:t>
+                      <m:t xml:space="preserve"> -8,</m:t>
+                    </m:r>
+                    <m:r>
+                      <w:rPr>
+                        <w:rFonts w:ascii="Cambria Math" w:hAnsi="Cambria Math" w:cs="Times New Roman"/>
+                        <w:sz w:val="24"/>
+                        <w:szCs w:val="24"/>
+                      </w:rPr>
+                      <m:t>333</m:t>
+                    </m:r>
+                    <m:r>
+                      <w:rPr>
+                        <w:rFonts w:ascii="Cambria Math" w:hAnsi="Cambria Math" w:cs="Times New Roman"/>
+                        <w:sz w:val="24"/>
+                        <w:szCs w:val="24"/>
+                      </w:rPr>
+                      <m:t xml:space="preserve">  .   .   .  </m:t>
                     </m:r>
                     <m:sSub>
                       <m:sSubPr>
@@ -246,7 +262,7 @@
                             <w:sz w:val="24"/>
                             <w:szCs w:val="24"/>
                           </w:rPr>
-                          <m:t>6</m:t>
+                          <m:t>3</m:t>
                         </m:r>
                       </m:e>
                       <m:sub>
@@ -350,7 +366,7 @@
                                 <w:sz w:val="24"/>
                                 <w:szCs w:val="24"/>
                               </w:rPr>
-                              <m:t xml:space="preserve"> -8,329416  .   .   .    </m:t>
+                              <m:t xml:space="preserve"> -8,333  .   .   .  </m:t>
                             </m:r>
                             <m:sSub>
                               <m:sSubPr>
@@ -370,7 +386,7 @@
                                     <w:sz w:val="24"/>
                                     <w:szCs w:val="24"/>
                                   </w:rPr>
-                                  <m:t>6</m:t>
+                                  <m:t>3</m:t>
                                 </m:r>
                               </m:e>
                               <m:sub>
@@ -525,7 +541,7 @@
                         <w:sz w:val="24"/>
                         <w:szCs w:val="24"/>
                       </w:rPr>
-                      <m:t xml:space="preserve"> -8,329416  .   .   .    </m:t>
+                      <m:t xml:space="preserve"> -8,333  .   .   .  </m:t>
                     </m:r>
                     <m:sSub>
                       <m:sSubPr>
@@ -545,7 +561,7 @@
                             <w:sz w:val="24"/>
                             <w:szCs w:val="24"/>
                           </w:rPr>
-                          <m:t>6</m:t>
+                          <m:t>3</m:t>
                         </m:r>
                       </m:e>
                       <m:sub>
@@ -649,7 +665,7 @@
                                 <w:sz w:val="24"/>
                                 <w:szCs w:val="24"/>
                               </w:rPr>
-                              <m:t xml:space="preserve"> -8,329416  .   .   .    </m:t>
+                              <m:t xml:space="preserve"> -8,333  .   .   .  </m:t>
                             </m:r>
                             <m:sSub>
                               <m:sSubPr>
@@ -669,7 +685,7 @@
                                     <w:sz w:val="24"/>
                                     <w:szCs w:val="24"/>
                                   </w:rPr>
-                                  <m:t>6</m:t>
+                                  <m:t>3</m:t>
                                 </m:r>
                               </m:e>
                               <m:sub>

</xml_diff>